<commit_message>
i added my proper resume, fixed some styles and fonts
</commit_message>
<xml_diff>
--- a/public/CruzBrandonResume.docx
+++ b/public/CruzBrandonResume.docx
@@ -1,6 +1,6 @@
 
 <file path=word/document.xml><?xml version="1.0" encoding="utf-8"?>
-<w:document xmlns:wpc="http://schemas.microsoft.com/office/word/2010/wordprocessingCanvas" xmlns:cx="http://schemas.microsoft.com/office/drawing/2014/chartex" xmlns:cx1="http://schemas.microsoft.com/office/drawing/2015/9/8/chartex" xmlns:cx2="http://schemas.microsoft.com/office/drawing/2015/10/21/chartex" xmlns:cx3="http://schemas.microsoft.com/office/drawing/2016/5/9/chartex" xmlns:cx4="http://schemas.microsoft.com/office/drawing/2016/5/10/chartex" xmlns:cx5="http://schemas.microsoft.com/office/drawing/2016/5/11/chartex" xmlns:cx6="http://schemas.microsoft.com/office/drawing/2016/5/12/chartex" xmlns:cx7="http://schemas.microsoft.com/office/drawing/2016/5/13/chartex" xmlns:cx8="http://schemas.microsoft.com/office/drawing/2016/5/14/chartex" xmlns:mc="http://schemas.openxmlformats.org/markup-compatibility/2006" xmlns:aink="http://schemas.microsoft.com/office/drawing/2016/ink" xmlns:am3d="http://schemas.microsoft.com/office/drawing/2017/model3d" xmlns:o="urn:schemas-microsoft-com:office:office" xmlns:oel="http://schemas.microsoft.com/office/2019/extlst" xmlns:r="http://schemas.openxmlformats.org/officeDocument/2006/relationships" xmlns:m="http://schemas.openxmlformats.org/officeDocument/2006/math" xmlns:v="urn:schemas-microsoft-com:vml" xmlns:wp14="http://schemas.microsoft.com/office/word/2010/wordprocessingDrawing" xmlns:wp="http://schemas.openxmlformats.org/drawingml/2006/wordprocessingDrawing" xmlns:w10="urn:schemas-microsoft-com:office:word" xmlns:w="http://schemas.openxmlformats.org/wordprocessingml/2006/main" xmlns:w14="http://schemas.microsoft.com/office/word/2010/wordml" xmlns:w15="http://schemas.microsoft.com/office/word/2012/wordml" xmlns:w16cex="http://schemas.microsoft.com/office/word/2018/wordml/cex" xmlns:w16cid="http://schemas.microsoft.com/office/word/2016/wordml/cid" xmlns:w16="http://schemas.microsoft.com/office/word/2018/wordml" xmlns:w16du="http://schemas.microsoft.com/office/word/2023/wordml/word16du" xmlns:w16sdtdh="http://schemas.microsoft.com/office/word/2020/wordml/sdtdatahash" xmlns:w16se="http://schemas.microsoft.com/office/word/2015/wordml/symex" xmlns:wpg="http://schemas.microsoft.com/office/word/2010/wordprocessingGroup" xmlns:wpi="http://schemas.microsoft.com/office/word/2010/wordprocessingInk" xmlns:wne="http://schemas.microsoft.com/office/word/2006/wordml" xmlns:wps="http://schemas.microsoft.com/office/word/2010/wordprocessingShape" mc:Ignorable="w14 w15 w16se w16cid w16 w16cex w16sdtdh w16du wp14">
+<w:document xmlns:wpc="http://schemas.microsoft.com/office/word/2010/wordprocessingCanvas" xmlns:cx="http://schemas.microsoft.com/office/drawing/2014/chartex" xmlns:cx1="http://schemas.microsoft.com/office/drawing/2015/9/8/chartex" xmlns:cx2="http://schemas.microsoft.com/office/drawing/2015/10/21/chartex" xmlns:cx3="http://schemas.microsoft.com/office/drawing/2016/5/9/chartex" xmlns:cx4="http://schemas.microsoft.com/office/drawing/2016/5/10/chartex" xmlns:cx5="http://schemas.microsoft.com/office/drawing/2016/5/11/chartex" xmlns:cx6="http://schemas.microsoft.com/office/drawing/2016/5/12/chartex" xmlns:cx7="http://schemas.microsoft.com/office/drawing/2016/5/13/chartex" xmlns:cx8="http://schemas.microsoft.com/office/drawing/2016/5/14/chartex" xmlns:mc="http://schemas.openxmlformats.org/markup-compatibility/2006" xmlns:aink="http://schemas.microsoft.com/office/drawing/2016/ink" xmlns:am3d="http://schemas.microsoft.com/office/drawing/2017/model3d" xmlns:o="urn:schemas-microsoft-com:office:office" xmlns:oel="http://schemas.microsoft.com/office/2019/extlst" xmlns:r="http://schemas.openxmlformats.org/officeDocument/2006/relationships" xmlns:m="http://schemas.openxmlformats.org/officeDocument/2006/math" xmlns:v="urn:schemas-microsoft-com:vml" xmlns:wp14="http://schemas.microsoft.com/office/word/2010/wordprocessingDrawing" xmlns:wp="http://schemas.openxmlformats.org/drawingml/2006/wordprocessingDrawing" xmlns:w10="urn:schemas-microsoft-com:office:word" xmlns:w="http://schemas.openxmlformats.org/wordprocessingml/2006/main" xmlns:w14="http://schemas.microsoft.com/office/word/2010/wordml" xmlns:w15="http://schemas.microsoft.com/office/word/2012/wordml" xmlns:w16cex="http://schemas.microsoft.com/office/word/2018/wordml/cex" xmlns:w16cid="http://schemas.microsoft.com/office/word/2016/wordml/cid" xmlns:w16="http://schemas.microsoft.com/office/word/2018/wordml" xmlns:w16du="http://schemas.microsoft.com/office/word/2023/wordml/word16du" xmlns:w16sdtdh="http://schemas.microsoft.com/office/word/2020/wordml/sdtdatahash" xmlns:w16sdtfl="http://schemas.microsoft.com/office/word/2024/wordml/sdtformatlock" xmlns:w16se="http://schemas.microsoft.com/office/word/2015/wordml/symex" xmlns:wpg="http://schemas.microsoft.com/office/word/2010/wordprocessingGroup" xmlns:wpi="http://schemas.microsoft.com/office/word/2010/wordprocessingInk" xmlns:wne="http://schemas.microsoft.com/office/word/2006/wordml" xmlns:wps="http://schemas.microsoft.com/office/word/2010/wordprocessingShape" mc:Ignorable="w14 w15 w16se w16cid w16 w16cex w16sdtdh w16sdtfl w16du wp14">
   <w:body>
     <w:p>
       <w:pPr>
@@ -17,7 +17,6 @@
           <w:b w:val="0"/>
           <w:bCs/>
           <w:szCs w:val="24"/>
-          <w:lang w:val="es-US"/>
         </w:rPr>
       </w:pPr>
       <w:r>
@@ -26,7 +25,6 @@
           <w:b w:val="0"/>
           <w:bCs/>
           <w:szCs w:val="24"/>
-          <w:lang w:val="es-US"/>
         </w:rPr>
         <w:t>Miami, Florida</w:t>
       </w:r>
@@ -36,9 +34,8 @@
           <w:b w:val="0"/>
           <w:bCs/>
           <w:szCs w:val="24"/>
-          <w:lang w:val="es-US"/>
-        </w:rPr>
-        <w:t xml:space="preserve">                                                                                                                                           </w:t>
+        </w:rPr>
+        <w:t xml:space="preserve">                                                                                                                                           Cell: 305-904-3878</w:t>
       </w:r>
       <w:r>
         <w:rPr>
@@ -46,9 +43,8 @@
           <w:b w:val="0"/>
           <w:bCs/>
           <w:szCs w:val="24"/>
-          <w:lang w:val="es-US"/>
-        </w:rPr>
-        <w:t>Cell: 305-904-3878</w:t>
+        </w:rPr>
+        <w:tab/>
       </w:r>
       <w:r>
         <w:rPr>
@@ -56,17 +52,6 @@
           <w:b w:val="0"/>
           <w:bCs/>
           <w:szCs w:val="24"/>
-          <w:lang w:val="es-US"/>
-        </w:rPr>
-        <w:tab/>
-      </w:r>
-      <w:r>
-        <w:rPr>
-          <w:rFonts w:ascii="Calibri" w:hAnsi="Calibri" w:cs="Calibri"/>
-          <w:b w:val="0"/>
-          <w:bCs/>
-          <w:szCs w:val="24"/>
-          <w:lang w:val="es-US"/>
         </w:rPr>
         <w:t xml:space="preserve">         </w:t>
       </w:r>
@@ -911,8 +896,8 @@
         <w:pStyle w:val="Thesis"/>
         <w:spacing w:after="0"/>
         <w:rPr>
-          <w:rStyle w:val="Emphasis"/>
-          <w:rFonts w:ascii="Calibri" w:hAnsi="Calibri" w:cs="Calibri"/>
+          <w:rFonts w:ascii="Calibri" w:hAnsi="Calibri" w:cs="Calibri"/>
+          <w:b/>
           <w:sz w:val="28"/>
           <w:szCs w:val="28"/>
         </w:rPr>
@@ -926,6 +911,248 @@
         </w:rPr>
         <w:t>EXPERIENCE</w:t>
       </w:r>
+    </w:p>
+    <w:p>
+      <w:pPr>
+        <w:pStyle w:val="Thesis"/>
+        <w:spacing w:after="0"/>
+        <w:rPr>
+          <w:rFonts w:ascii="Calibri" w:hAnsi="Calibri" w:cs="Calibri"/>
+          <w:b/>
+          <w:sz w:val="22"/>
+          <w:szCs w:val="22"/>
+        </w:rPr>
+      </w:pPr>
+      <w:r>
+        <w:rPr>
+          <w:rFonts w:ascii="Calibri" w:hAnsi="Calibri" w:cs="Calibri"/>
+          <w:b/>
+          <w:sz w:val="22"/>
+          <w:szCs w:val="22"/>
+        </w:rPr>
+        <w:t xml:space="preserve">IMMACULATE CONCEPTION CATHOLIC SCHOOL – </w:t>
+      </w:r>
+      <w:r>
+        <w:rPr>
+          <w:rFonts w:ascii="Calibri" w:hAnsi="Calibri" w:cs="Calibri"/>
+          <w:bCs/>
+          <w:sz w:val="22"/>
+          <w:szCs w:val="22"/>
+        </w:rPr>
+        <w:t xml:space="preserve">Hialeah, Florida                                                       </w:t>
+      </w:r>
+      <w:r>
+        <w:rPr>
+          <w:rFonts w:ascii="Calibri" w:hAnsi="Calibri" w:cs="Calibri"/>
+          <w:b/>
+          <w:sz w:val="22"/>
+          <w:szCs w:val="22"/>
+        </w:rPr>
+        <w:t>October 2025 – Present</w:t>
+      </w:r>
+    </w:p>
+    <w:p>
+      <w:pPr>
+        <w:pStyle w:val="Thesis"/>
+        <w:spacing w:after="0"/>
+        <w:rPr>
+          <w:rStyle w:val="Emphasis"/>
+          <w:rFonts w:ascii="Calibri" w:hAnsi="Calibri" w:cs="Calibri"/>
+          <w:b/>
+          <w:i w:val="0"/>
+          <w:iCs w:val="0"/>
+          <w:sz w:val="22"/>
+          <w:szCs w:val="22"/>
+        </w:rPr>
+      </w:pPr>
+      <w:r>
+        <w:rPr>
+          <w:rStyle w:val="Emphasis"/>
+          <w:rFonts w:ascii="Calibri" w:hAnsi="Calibri" w:cs="Calibri"/>
+          <w:b/>
+          <w:i w:val="0"/>
+          <w:iCs w:val="0"/>
+          <w:sz w:val="22"/>
+          <w:szCs w:val="22"/>
+        </w:rPr>
+        <w:t>IT Support Specialist</w:t>
+      </w:r>
+    </w:p>
+    <w:p>
+      <w:pPr>
+        <w:pStyle w:val="Thesis"/>
+        <w:numPr>
+          <w:ilvl w:val="0"/>
+          <w:numId w:val="26"/>
+        </w:numPr>
+        <w:spacing w:after="0"/>
+        <w:rPr>
+          <w:rStyle w:val="Emphasis"/>
+          <w:rFonts w:ascii="Calibri" w:hAnsi="Calibri" w:cs="Calibri"/>
+          <w:b/>
+          <w:i w:val="0"/>
+          <w:iCs w:val="0"/>
+          <w:sz w:val="22"/>
+          <w:szCs w:val="22"/>
+        </w:rPr>
+      </w:pPr>
+      <w:r>
+        <w:rPr>
+          <w:rStyle w:val="Emphasis"/>
+          <w:rFonts w:ascii="Calibri" w:hAnsi="Calibri" w:cs="Calibri"/>
+          <w:bCs/>
+          <w:i w:val="0"/>
+          <w:iCs w:val="0"/>
+          <w:sz w:val="22"/>
+          <w:szCs w:val="22"/>
+        </w:rPr>
+        <w:t>Troubleshooting and resolving technical issues across diverse platforms and devices</w:t>
+      </w:r>
+      <w:r>
+        <w:rPr>
+          <w:rStyle w:val="Emphasis"/>
+          <w:rFonts w:ascii="Calibri" w:hAnsi="Calibri" w:cs="Calibri"/>
+          <w:bCs/>
+          <w:i w:val="0"/>
+          <w:iCs w:val="0"/>
+          <w:sz w:val="22"/>
+          <w:szCs w:val="22"/>
+        </w:rPr>
+        <w:t xml:space="preserve"> at the school and parish</w:t>
+      </w:r>
+      <w:r>
+        <w:rPr>
+          <w:rStyle w:val="Emphasis"/>
+          <w:rFonts w:ascii="Calibri" w:hAnsi="Calibri" w:cs="Calibri"/>
+          <w:bCs/>
+          <w:i w:val="0"/>
+          <w:iCs w:val="0"/>
+          <w:sz w:val="22"/>
+          <w:szCs w:val="22"/>
+        </w:rPr>
+        <w:t>.</w:t>
+      </w:r>
+    </w:p>
+    <w:p>
+      <w:pPr>
+        <w:pStyle w:val="Thesis"/>
+        <w:numPr>
+          <w:ilvl w:val="0"/>
+          <w:numId w:val="26"/>
+        </w:numPr>
+        <w:spacing w:after="0"/>
+        <w:rPr>
+          <w:rStyle w:val="Emphasis"/>
+          <w:rFonts w:ascii="Calibri" w:hAnsi="Calibri" w:cs="Calibri"/>
+          <w:b/>
+          <w:i w:val="0"/>
+          <w:iCs w:val="0"/>
+          <w:sz w:val="22"/>
+          <w:szCs w:val="22"/>
+        </w:rPr>
+      </w:pPr>
+      <w:r>
+        <w:rPr>
+          <w:rStyle w:val="Emphasis"/>
+          <w:rFonts w:ascii="Calibri" w:hAnsi="Calibri" w:cs="Calibri"/>
+          <w:bCs/>
+          <w:i w:val="0"/>
+          <w:iCs w:val="0"/>
+          <w:sz w:val="22"/>
+          <w:szCs w:val="22"/>
+        </w:rPr>
+        <w:t xml:space="preserve">Supporting users via phone, chat, or in-person, with strong communication skills to explain technical </w:t>
+      </w:r>
+      <w:r>
+        <w:rPr>
+          <w:rStyle w:val="Emphasis"/>
+          <w:rFonts w:ascii="Calibri" w:hAnsi="Calibri" w:cs="Calibri"/>
+          <w:bCs/>
+          <w:i w:val="0"/>
+          <w:iCs w:val="0"/>
+          <w:sz w:val="22"/>
+          <w:szCs w:val="22"/>
+        </w:rPr>
+        <w:t xml:space="preserve">concepts clearly. </w:t>
+      </w:r>
+    </w:p>
+    <w:p>
+      <w:pPr>
+        <w:pStyle w:val="Thesis"/>
+        <w:numPr>
+          <w:ilvl w:val="0"/>
+          <w:numId w:val="26"/>
+        </w:numPr>
+        <w:spacing w:after="0"/>
+        <w:rPr>
+          <w:rStyle w:val="Emphasis"/>
+          <w:rFonts w:ascii="Calibri" w:hAnsi="Calibri" w:cs="Calibri"/>
+          <w:b/>
+          <w:i w:val="0"/>
+          <w:iCs w:val="0"/>
+          <w:sz w:val="22"/>
+          <w:szCs w:val="22"/>
+        </w:rPr>
+      </w:pPr>
+      <w:r>
+        <w:rPr>
+          <w:rStyle w:val="Emphasis"/>
+          <w:rFonts w:ascii="Calibri" w:hAnsi="Calibri" w:cs="Calibri"/>
+          <w:bCs/>
+          <w:i w:val="0"/>
+          <w:iCs w:val="0"/>
+          <w:sz w:val="22"/>
+          <w:szCs w:val="22"/>
+        </w:rPr>
+        <w:t>Aid in the migration into Windows 11 with all the devices used within the school to continue using Microsoft 365 services and security implementations.</w:t>
+      </w:r>
+    </w:p>
+    <w:p>
+      <w:pPr>
+        <w:pStyle w:val="Thesis"/>
+        <w:numPr>
+          <w:ilvl w:val="0"/>
+          <w:numId w:val="26"/>
+        </w:numPr>
+        <w:spacing w:after="0"/>
+        <w:rPr>
+          <w:rStyle w:val="Emphasis"/>
+          <w:rFonts w:ascii="Calibri" w:hAnsi="Calibri" w:cs="Calibri"/>
+          <w:b/>
+          <w:i w:val="0"/>
+          <w:iCs w:val="0"/>
+          <w:sz w:val="22"/>
+          <w:szCs w:val="22"/>
+        </w:rPr>
+      </w:pPr>
+      <w:r>
+        <w:rPr>
+          <w:rStyle w:val="Emphasis"/>
+          <w:rFonts w:ascii="Calibri" w:hAnsi="Calibri" w:cs="Calibri"/>
+          <w:bCs/>
+          <w:i w:val="0"/>
+          <w:iCs w:val="0"/>
+          <w:sz w:val="22"/>
+          <w:szCs w:val="22"/>
+        </w:rPr>
+        <w:t>Ensuring compliance with security policies and supporting cybersecurity initiatives.</w:t>
+      </w:r>
+    </w:p>
+    <w:p>
+      <w:pPr>
+        <w:pStyle w:val="Thesis"/>
+        <w:spacing w:after="0"/>
+        <w:ind w:left="720"/>
+        <w:rPr>
+          <w:rStyle w:val="Emphasis"/>
+          <w:rFonts w:ascii="Calibri" w:hAnsi="Calibri" w:cs="Calibri"/>
+          <w:b/>
+          <w:i w:val="0"/>
+          <w:iCs w:val="0"/>
+          <w:sz w:val="22"/>
+          <w:szCs w:val="22"/>
+        </w:rPr>
+      </w:pPr>
     </w:p>
     <w:p>
       <w:pPr>
@@ -1106,6 +1333,7 @@
           <w:sz w:val="22"/>
           <w:szCs w:val="22"/>
         </w:rPr>
+        <w:lastRenderedPageBreak/>
         <w:t xml:space="preserve">Led the creation and ongoing development of a comprehensive dashboard for the </w:t>
       </w:r>
       <w:proofErr w:type="spellStart"/>
@@ -1217,7 +1445,6 @@
           <w:tab w:val="right" w:pos="9360"/>
         </w:tabs>
         <w:spacing w:after="0"/>
-        <w:ind w:left="360"/>
         <w:rPr>
           <w:rFonts w:ascii="Calibri" w:hAnsi="Calibri" w:cs="Calibri"/>
           <w:b/>
@@ -1243,66 +1470,14 @@
           <w:szCs w:val="22"/>
         </w:rPr>
       </w:pPr>
-    </w:p>
-    <w:p>
-      <w:pPr>
-        <w:pStyle w:val="Thesis"/>
-        <w:tabs>
-          <w:tab w:val="left" w:pos="3825"/>
-          <w:tab w:val="right" w:pos="9360"/>
-        </w:tabs>
-        <w:spacing w:after="0"/>
-        <w:rPr>
-          <w:rFonts w:ascii="Calibri" w:hAnsi="Calibri" w:cs="Calibri"/>
-          <w:b/>
-          <w:bCs/>
-          <w:sz w:val="22"/>
-          <w:szCs w:val="22"/>
-        </w:rPr>
-      </w:pPr>
-    </w:p>
-    <w:p>
-      <w:pPr>
-        <w:pStyle w:val="Thesis"/>
-        <w:tabs>
-          <w:tab w:val="left" w:pos="3825"/>
-          <w:tab w:val="right" w:pos="9360"/>
-        </w:tabs>
-        <w:spacing w:after="0"/>
-        <w:rPr>
-          <w:rFonts w:ascii="Calibri" w:hAnsi="Calibri" w:cs="Calibri"/>
-          <w:b/>
-          <w:bCs/>
-          <w:sz w:val="22"/>
-          <w:szCs w:val="22"/>
-        </w:rPr>
-      </w:pPr>
-    </w:p>
-    <w:p>
-      <w:pPr>
-        <w:pStyle w:val="Thesis"/>
-        <w:tabs>
-          <w:tab w:val="left" w:pos="3825"/>
-          <w:tab w:val="right" w:pos="9360"/>
-        </w:tabs>
-        <w:spacing w:after="0"/>
-        <w:rPr>
-          <w:rFonts w:ascii="Calibri" w:hAnsi="Calibri" w:cs="Calibri"/>
-          <w:b/>
-          <w:bCs/>
-          <w:sz w:val="22"/>
-          <w:szCs w:val="22"/>
-        </w:rPr>
-      </w:pPr>
-      <w:r>
-        <w:rPr>
-          <w:rFonts w:ascii="Calibri" w:hAnsi="Calibri" w:cs="Calibri"/>
-          <w:b/>
-          <w:bCs/>
-          <w:sz w:val="22"/>
-          <w:szCs w:val="22"/>
-        </w:rPr>
-        <w:lastRenderedPageBreak/>
+      <w:r>
+        <w:rPr>
+          <w:rFonts w:ascii="Calibri" w:hAnsi="Calibri" w:cs="Calibri"/>
+          <w:b/>
+          <w:bCs/>
+          <w:sz w:val="22"/>
+          <w:szCs w:val="22"/>
+        </w:rPr>
         <w:t xml:space="preserve">All </w:t>
       </w:r>
       <w:r>
@@ -1726,16 +1901,7 @@
           <w:sz w:val="22"/>
           <w:szCs w:val="22"/>
         </w:rPr>
-        <w:t>NOVA SOUTHEASTERN UNIVERSITY</w:t>
-      </w:r>
-      <w:r>
-        <w:rPr>
-          <w:rFonts w:ascii="Calibri" w:hAnsi="Calibri" w:cs="Calibri"/>
-          <w:b/>
-          <w:sz w:val="22"/>
-          <w:szCs w:val="22"/>
-        </w:rPr>
-        <w:t xml:space="preserve"> – </w:t>
+        <w:t xml:space="preserve">NOVA SOUTHEASTERN UNIVERSITY – </w:t>
       </w:r>
       <w:r>
         <w:rPr>
@@ -2256,7 +2422,7 @@
 </file>
 
 <file path=word/endnotes.xml><?xml version="1.0" encoding="utf-8"?>
-<w:endnotes xmlns:wpc="http://schemas.microsoft.com/office/word/2010/wordprocessingCanvas" xmlns:cx="http://schemas.microsoft.com/office/drawing/2014/chartex" xmlns:cx1="http://schemas.microsoft.com/office/drawing/2015/9/8/chartex" xmlns:cx2="http://schemas.microsoft.com/office/drawing/2015/10/21/chartex" xmlns:cx3="http://schemas.microsoft.com/office/drawing/2016/5/9/chartex" xmlns:cx4="http://schemas.microsoft.com/office/drawing/2016/5/10/chartex" xmlns:cx5="http://schemas.microsoft.com/office/drawing/2016/5/11/chartex" xmlns:cx6="http://schemas.microsoft.com/office/drawing/2016/5/12/chartex" xmlns:cx7="http://schemas.microsoft.com/office/drawing/2016/5/13/chartex" xmlns:cx8="http://schemas.microsoft.com/office/drawing/2016/5/14/chartex" xmlns:mc="http://schemas.openxmlformats.org/markup-compatibility/2006" xmlns:aink="http://schemas.microsoft.com/office/drawing/2016/ink" xmlns:am3d="http://schemas.microsoft.com/office/drawing/2017/model3d" xmlns:o="urn:schemas-microsoft-com:office:office" xmlns:oel="http://schemas.microsoft.com/office/2019/extlst" xmlns:r="http://schemas.openxmlformats.org/officeDocument/2006/relationships" xmlns:m="http://schemas.openxmlformats.org/officeDocument/2006/math" xmlns:v="urn:schemas-microsoft-com:vml" xmlns:wp14="http://schemas.microsoft.com/office/word/2010/wordprocessingDrawing" xmlns:wp="http://schemas.openxmlformats.org/drawingml/2006/wordprocessingDrawing" xmlns:w10="urn:schemas-microsoft-com:office:word" xmlns:w="http://schemas.openxmlformats.org/wordprocessingml/2006/main" xmlns:w14="http://schemas.microsoft.com/office/word/2010/wordml" xmlns:w15="http://schemas.microsoft.com/office/word/2012/wordml" xmlns:w16cex="http://schemas.microsoft.com/office/word/2018/wordml/cex" xmlns:w16cid="http://schemas.microsoft.com/office/word/2016/wordml/cid" xmlns:w16="http://schemas.microsoft.com/office/word/2018/wordml" xmlns:w16du="http://schemas.microsoft.com/office/word/2023/wordml/word16du" xmlns:w16sdtdh="http://schemas.microsoft.com/office/word/2020/wordml/sdtdatahash" xmlns:w16se="http://schemas.microsoft.com/office/word/2015/wordml/symex" xmlns:wpg="http://schemas.microsoft.com/office/word/2010/wordprocessingGroup" xmlns:wpi="http://schemas.microsoft.com/office/word/2010/wordprocessingInk" xmlns:wne="http://schemas.microsoft.com/office/word/2006/wordml" xmlns:wps="http://schemas.microsoft.com/office/word/2010/wordprocessingShape" mc:Ignorable="w14 w15 w16se w16cid w16 w16cex w16sdtdh w16du wp14">
+<w:endnotes xmlns:wpc="http://schemas.microsoft.com/office/word/2010/wordprocessingCanvas" xmlns:cx="http://schemas.microsoft.com/office/drawing/2014/chartex" xmlns:cx1="http://schemas.microsoft.com/office/drawing/2015/9/8/chartex" xmlns:cx2="http://schemas.microsoft.com/office/drawing/2015/10/21/chartex" xmlns:cx3="http://schemas.microsoft.com/office/drawing/2016/5/9/chartex" xmlns:cx4="http://schemas.microsoft.com/office/drawing/2016/5/10/chartex" xmlns:cx5="http://schemas.microsoft.com/office/drawing/2016/5/11/chartex" xmlns:cx6="http://schemas.microsoft.com/office/drawing/2016/5/12/chartex" xmlns:cx7="http://schemas.microsoft.com/office/drawing/2016/5/13/chartex" xmlns:cx8="http://schemas.microsoft.com/office/drawing/2016/5/14/chartex" xmlns:mc="http://schemas.openxmlformats.org/markup-compatibility/2006" xmlns:aink="http://schemas.microsoft.com/office/drawing/2016/ink" xmlns:am3d="http://schemas.microsoft.com/office/drawing/2017/model3d" xmlns:o="urn:schemas-microsoft-com:office:office" xmlns:oel="http://schemas.microsoft.com/office/2019/extlst" xmlns:r="http://schemas.openxmlformats.org/officeDocument/2006/relationships" xmlns:m="http://schemas.openxmlformats.org/officeDocument/2006/math" xmlns:v="urn:schemas-microsoft-com:vml" xmlns:wp14="http://schemas.microsoft.com/office/word/2010/wordprocessingDrawing" xmlns:wp="http://schemas.openxmlformats.org/drawingml/2006/wordprocessingDrawing" xmlns:w10="urn:schemas-microsoft-com:office:word" xmlns:w="http://schemas.openxmlformats.org/wordprocessingml/2006/main" xmlns:w14="http://schemas.microsoft.com/office/word/2010/wordml" xmlns:w15="http://schemas.microsoft.com/office/word/2012/wordml" xmlns:w16cex="http://schemas.microsoft.com/office/word/2018/wordml/cex" xmlns:w16cid="http://schemas.microsoft.com/office/word/2016/wordml/cid" xmlns:w16="http://schemas.microsoft.com/office/word/2018/wordml" xmlns:w16du="http://schemas.microsoft.com/office/word/2023/wordml/word16du" xmlns:w16sdtdh="http://schemas.microsoft.com/office/word/2020/wordml/sdtdatahash" xmlns:w16sdtfl="http://schemas.microsoft.com/office/word/2024/wordml/sdtformatlock" xmlns:w16se="http://schemas.microsoft.com/office/word/2015/wordml/symex" xmlns:wpg="http://schemas.microsoft.com/office/word/2010/wordprocessingGroup" xmlns:wpi="http://schemas.microsoft.com/office/word/2010/wordprocessingInk" xmlns:wne="http://schemas.microsoft.com/office/word/2006/wordml" xmlns:wps="http://schemas.microsoft.com/office/word/2010/wordprocessingShape" mc:Ignorable="w14 w15 w16se w16cid w16 w16cex w16sdtdh w16sdtfl w16du wp14">
   <w:endnote w:type="separator" w:id="-1">
     <w:p>
       <w:r>
@@ -2275,7 +2441,7 @@
 </file>
 
 <file path=word/footnotes.xml><?xml version="1.0" encoding="utf-8"?>
-<w:footnotes xmlns:wpc="http://schemas.microsoft.com/office/word/2010/wordprocessingCanvas" xmlns:cx="http://schemas.microsoft.com/office/drawing/2014/chartex" xmlns:cx1="http://schemas.microsoft.com/office/drawing/2015/9/8/chartex" xmlns:cx2="http://schemas.microsoft.com/office/drawing/2015/10/21/chartex" xmlns:cx3="http://schemas.microsoft.com/office/drawing/2016/5/9/chartex" xmlns:cx4="http://schemas.microsoft.com/office/drawing/2016/5/10/chartex" xmlns:cx5="http://schemas.microsoft.com/office/drawing/2016/5/11/chartex" xmlns:cx6="http://schemas.microsoft.com/office/drawing/2016/5/12/chartex" xmlns:cx7="http://schemas.microsoft.com/office/drawing/2016/5/13/chartex" xmlns:cx8="http://schemas.microsoft.com/office/drawing/2016/5/14/chartex" xmlns:mc="http://schemas.openxmlformats.org/markup-compatibility/2006" xmlns:aink="http://schemas.microsoft.com/office/drawing/2016/ink" xmlns:am3d="http://schemas.microsoft.com/office/drawing/2017/model3d" xmlns:o="urn:schemas-microsoft-com:office:office" xmlns:oel="http://schemas.microsoft.com/office/2019/extlst" xmlns:r="http://schemas.openxmlformats.org/officeDocument/2006/relationships" xmlns:m="http://schemas.openxmlformats.org/officeDocument/2006/math" xmlns:v="urn:schemas-microsoft-com:vml" xmlns:wp14="http://schemas.microsoft.com/office/word/2010/wordprocessingDrawing" xmlns:wp="http://schemas.openxmlformats.org/drawingml/2006/wordprocessingDrawing" xmlns:w10="urn:schemas-microsoft-com:office:word" xmlns:w="http://schemas.openxmlformats.org/wordprocessingml/2006/main" xmlns:w14="http://schemas.microsoft.com/office/word/2010/wordml" xmlns:w15="http://schemas.microsoft.com/office/word/2012/wordml" xmlns:w16cex="http://schemas.microsoft.com/office/word/2018/wordml/cex" xmlns:w16cid="http://schemas.microsoft.com/office/word/2016/wordml/cid" xmlns:w16="http://schemas.microsoft.com/office/word/2018/wordml" xmlns:w16du="http://schemas.microsoft.com/office/word/2023/wordml/word16du" xmlns:w16sdtdh="http://schemas.microsoft.com/office/word/2020/wordml/sdtdatahash" xmlns:w16se="http://schemas.microsoft.com/office/word/2015/wordml/symex" xmlns:wpg="http://schemas.microsoft.com/office/word/2010/wordprocessingGroup" xmlns:wpi="http://schemas.microsoft.com/office/word/2010/wordprocessingInk" xmlns:wne="http://schemas.microsoft.com/office/word/2006/wordml" xmlns:wps="http://schemas.microsoft.com/office/word/2010/wordprocessingShape" mc:Ignorable="w14 w15 w16se w16cid w16 w16cex w16sdtdh w16du wp14">
+<w:footnotes xmlns:wpc="http://schemas.microsoft.com/office/word/2010/wordprocessingCanvas" xmlns:cx="http://schemas.microsoft.com/office/drawing/2014/chartex" xmlns:cx1="http://schemas.microsoft.com/office/drawing/2015/9/8/chartex" xmlns:cx2="http://schemas.microsoft.com/office/drawing/2015/10/21/chartex" xmlns:cx3="http://schemas.microsoft.com/office/drawing/2016/5/9/chartex" xmlns:cx4="http://schemas.microsoft.com/office/drawing/2016/5/10/chartex" xmlns:cx5="http://schemas.microsoft.com/office/drawing/2016/5/11/chartex" xmlns:cx6="http://schemas.microsoft.com/office/drawing/2016/5/12/chartex" xmlns:cx7="http://schemas.microsoft.com/office/drawing/2016/5/13/chartex" xmlns:cx8="http://schemas.microsoft.com/office/drawing/2016/5/14/chartex" xmlns:mc="http://schemas.openxmlformats.org/markup-compatibility/2006" xmlns:aink="http://schemas.microsoft.com/office/drawing/2016/ink" xmlns:am3d="http://schemas.microsoft.com/office/drawing/2017/model3d" xmlns:o="urn:schemas-microsoft-com:office:office" xmlns:oel="http://schemas.microsoft.com/office/2019/extlst" xmlns:r="http://schemas.openxmlformats.org/officeDocument/2006/relationships" xmlns:m="http://schemas.openxmlformats.org/officeDocument/2006/math" xmlns:v="urn:schemas-microsoft-com:vml" xmlns:wp14="http://schemas.microsoft.com/office/word/2010/wordprocessingDrawing" xmlns:wp="http://schemas.openxmlformats.org/drawingml/2006/wordprocessingDrawing" xmlns:w10="urn:schemas-microsoft-com:office:word" xmlns:w="http://schemas.openxmlformats.org/wordprocessingml/2006/main" xmlns:w14="http://schemas.microsoft.com/office/word/2010/wordml" xmlns:w15="http://schemas.microsoft.com/office/word/2012/wordml" xmlns:w16cex="http://schemas.microsoft.com/office/word/2018/wordml/cex" xmlns:w16cid="http://schemas.microsoft.com/office/word/2016/wordml/cid" xmlns:w16="http://schemas.microsoft.com/office/word/2018/wordml" xmlns:w16du="http://schemas.microsoft.com/office/word/2023/wordml/word16du" xmlns:w16sdtdh="http://schemas.microsoft.com/office/word/2020/wordml/sdtdatahash" xmlns:w16sdtfl="http://schemas.microsoft.com/office/word/2024/wordml/sdtformatlock" xmlns:w16se="http://schemas.microsoft.com/office/word/2015/wordml/symex" xmlns:wpg="http://schemas.microsoft.com/office/word/2010/wordprocessingGroup" xmlns:wpi="http://schemas.microsoft.com/office/word/2010/wordprocessingInk" xmlns:wne="http://schemas.microsoft.com/office/word/2006/wordml" xmlns:wps="http://schemas.microsoft.com/office/word/2010/wordprocessingShape" mc:Ignorable="w14 w15 w16se w16cid w16 w16cex w16sdtdh w16sdtfl w16du wp14">
   <w:footnote w:type="separator" w:id="-1">
     <w:p>
       <w:r>
@@ -2294,7 +2460,7 @@
 </file>
 
 <file path=word/header1.xml><?xml version="1.0" encoding="utf-8"?>
-<w:hdr xmlns:wpc="http://schemas.microsoft.com/office/word/2010/wordprocessingCanvas" xmlns:cx="http://schemas.microsoft.com/office/drawing/2014/chartex" xmlns:cx1="http://schemas.microsoft.com/office/drawing/2015/9/8/chartex" xmlns:cx2="http://schemas.microsoft.com/office/drawing/2015/10/21/chartex" xmlns:cx3="http://schemas.microsoft.com/office/drawing/2016/5/9/chartex" xmlns:cx4="http://schemas.microsoft.com/office/drawing/2016/5/10/chartex" xmlns:cx5="http://schemas.microsoft.com/office/drawing/2016/5/11/chartex" xmlns:cx6="http://schemas.microsoft.com/office/drawing/2016/5/12/chartex" xmlns:cx7="http://schemas.microsoft.com/office/drawing/2016/5/13/chartex" xmlns:cx8="http://schemas.microsoft.com/office/drawing/2016/5/14/chartex" xmlns:mc="http://schemas.openxmlformats.org/markup-compatibility/2006" xmlns:aink="http://schemas.microsoft.com/office/drawing/2016/ink" xmlns:am3d="http://schemas.microsoft.com/office/drawing/2017/model3d" xmlns:o="urn:schemas-microsoft-com:office:office" xmlns:oel="http://schemas.microsoft.com/office/2019/extlst" xmlns:r="http://schemas.openxmlformats.org/officeDocument/2006/relationships" xmlns:m="http://schemas.openxmlformats.org/officeDocument/2006/math" xmlns:v="urn:schemas-microsoft-com:vml" xmlns:wp14="http://schemas.microsoft.com/office/word/2010/wordprocessingDrawing" xmlns:wp="http://schemas.openxmlformats.org/drawingml/2006/wordprocessingDrawing" xmlns:w10="urn:schemas-microsoft-com:office:word" xmlns:w="http://schemas.openxmlformats.org/wordprocessingml/2006/main" xmlns:w14="http://schemas.microsoft.com/office/word/2010/wordml" xmlns:w15="http://schemas.microsoft.com/office/word/2012/wordml" xmlns:w16cex="http://schemas.microsoft.com/office/word/2018/wordml/cex" xmlns:w16cid="http://schemas.microsoft.com/office/word/2016/wordml/cid" xmlns:w16="http://schemas.microsoft.com/office/word/2018/wordml" xmlns:w16du="http://schemas.microsoft.com/office/word/2023/wordml/word16du" xmlns:w16sdtdh="http://schemas.microsoft.com/office/word/2020/wordml/sdtdatahash" xmlns:w16se="http://schemas.microsoft.com/office/word/2015/wordml/symex" xmlns:wpg="http://schemas.microsoft.com/office/word/2010/wordprocessingGroup" xmlns:wpi="http://schemas.microsoft.com/office/word/2010/wordprocessingInk" xmlns:wne="http://schemas.microsoft.com/office/word/2006/wordml" xmlns:wps="http://schemas.microsoft.com/office/word/2010/wordprocessingShape" mc:Ignorable="w14 w15 w16se w16cid w16 w16cex w16sdtdh w16du wp14">
+<w:hdr xmlns:wpc="http://schemas.microsoft.com/office/word/2010/wordprocessingCanvas" xmlns:cx="http://schemas.microsoft.com/office/drawing/2014/chartex" xmlns:cx1="http://schemas.microsoft.com/office/drawing/2015/9/8/chartex" xmlns:cx2="http://schemas.microsoft.com/office/drawing/2015/10/21/chartex" xmlns:cx3="http://schemas.microsoft.com/office/drawing/2016/5/9/chartex" xmlns:cx4="http://schemas.microsoft.com/office/drawing/2016/5/10/chartex" xmlns:cx5="http://schemas.microsoft.com/office/drawing/2016/5/11/chartex" xmlns:cx6="http://schemas.microsoft.com/office/drawing/2016/5/12/chartex" xmlns:cx7="http://schemas.microsoft.com/office/drawing/2016/5/13/chartex" xmlns:cx8="http://schemas.microsoft.com/office/drawing/2016/5/14/chartex" xmlns:mc="http://schemas.openxmlformats.org/markup-compatibility/2006" xmlns:aink="http://schemas.microsoft.com/office/drawing/2016/ink" xmlns:am3d="http://schemas.microsoft.com/office/drawing/2017/model3d" xmlns:o="urn:schemas-microsoft-com:office:office" xmlns:oel="http://schemas.microsoft.com/office/2019/extlst" xmlns:r="http://schemas.openxmlformats.org/officeDocument/2006/relationships" xmlns:m="http://schemas.openxmlformats.org/officeDocument/2006/math" xmlns:v="urn:schemas-microsoft-com:vml" xmlns:wp14="http://schemas.microsoft.com/office/word/2010/wordprocessingDrawing" xmlns:wp="http://schemas.openxmlformats.org/drawingml/2006/wordprocessingDrawing" xmlns:w10="urn:schemas-microsoft-com:office:word" xmlns:w="http://schemas.openxmlformats.org/wordprocessingml/2006/main" xmlns:w14="http://schemas.microsoft.com/office/word/2010/wordml" xmlns:w15="http://schemas.microsoft.com/office/word/2012/wordml" xmlns:w16cex="http://schemas.microsoft.com/office/word/2018/wordml/cex" xmlns:w16cid="http://schemas.microsoft.com/office/word/2016/wordml/cid" xmlns:w16="http://schemas.microsoft.com/office/word/2018/wordml" xmlns:w16du="http://schemas.microsoft.com/office/word/2023/wordml/word16du" xmlns:w16sdtdh="http://schemas.microsoft.com/office/word/2020/wordml/sdtdatahash" xmlns:w16sdtfl="http://schemas.microsoft.com/office/word/2024/wordml/sdtformatlock" xmlns:w16se="http://schemas.microsoft.com/office/word/2015/wordml/symex" xmlns:wpg="http://schemas.microsoft.com/office/word/2010/wordprocessingGroup" xmlns:wpi="http://schemas.microsoft.com/office/word/2010/wordprocessingInk" xmlns:wne="http://schemas.microsoft.com/office/word/2006/wordml" xmlns:wps="http://schemas.microsoft.com/office/word/2010/wordprocessingShape" mc:Ignorable="w14 w15 w16se w16cid w16 w16cex w16sdtdh w16sdtfl w16du wp14">
   <w:p>
     <w:pPr>
       <w:pStyle w:val="Title"/>
@@ -2404,7 +2570,7 @@
 </file>
 
 <file path=word/header2.xml><?xml version="1.0" encoding="utf-8"?>
-<w:hdr xmlns:wpc="http://schemas.microsoft.com/office/word/2010/wordprocessingCanvas" xmlns:cx="http://schemas.microsoft.com/office/drawing/2014/chartex" xmlns:cx1="http://schemas.microsoft.com/office/drawing/2015/9/8/chartex" xmlns:cx2="http://schemas.microsoft.com/office/drawing/2015/10/21/chartex" xmlns:cx3="http://schemas.microsoft.com/office/drawing/2016/5/9/chartex" xmlns:cx4="http://schemas.microsoft.com/office/drawing/2016/5/10/chartex" xmlns:cx5="http://schemas.microsoft.com/office/drawing/2016/5/11/chartex" xmlns:cx6="http://schemas.microsoft.com/office/drawing/2016/5/12/chartex" xmlns:cx7="http://schemas.microsoft.com/office/drawing/2016/5/13/chartex" xmlns:cx8="http://schemas.microsoft.com/office/drawing/2016/5/14/chartex" xmlns:mc="http://schemas.openxmlformats.org/markup-compatibility/2006" xmlns:aink="http://schemas.microsoft.com/office/drawing/2016/ink" xmlns:am3d="http://schemas.microsoft.com/office/drawing/2017/model3d" xmlns:o="urn:schemas-microsoft-com:office:office" xmlns:oel="http://schemas.microsoft.com/office/2019/extlst" xmlns:r="http://schemas.openxmlformats.org/officeDocument/2006/relationships" xmlns:m="http://schemas.openxmlformats.org/officeDocument/2006/math" xmlns:v="urn:schemas-microsoft-com:vml" xmlns:wp14="http://schemas.microsoft.com/office/word/2010/wordprocessingDrawing" xmlns:wp="http://schemas.openxmlformats.org/drawingml/2006/wordprocessingDrawing" xmlns:w10="urn:schemas-microsoft-com:office:word" xmlns:w="http://schemas.openxmlformats.org/wordprocessingml/2006/main" xmlns:w14="http://schemas.microsoft.com/office/word/2010/wordml" xmlns:w15="http://schemas.microsoft.com/office/word/2012/wordml" xmlns:w16cex="http://schemas.microsoft.com/office/word/2018/wordml/cex" xmlns:w16cid="http://schemas.microsoft.com/office/word/2016/wordml/cid" xmlns:w16="http://schemas.microsoft.com/office/word/2018/wordml" xmlns:w16du="http://schemas.microsoft.com/office/word/2023/wordml/word16du" xmlns:w16sdtdh="http://schemas.microsoft.com/office/word/2020/wordml/sdtdatahash" xmlns:w16se="http://schemas.microsoft.com/office/word/2015/wordml/symex" xmlns:wpg="http://schemas.microsoft.com/office/word/2010/wordprocessingGroup" xmlns:wpi="http://schemas.microsoft.com/office/word/2010/wordprocessingInk" xmlns:wne="http://schemas.microsoft.com/office/word/2006/wordml" xmlns:wps="http://schemas.microsoft.com/office/word/2010/wordprocessingShape" mc:Ignorable="w14 w15 w16se w16cid w16 w16cex w16sdtdh w16du wp14">
+<w:hdr xmlns:wpc="http://schemas.microsoft.com/office/word/2010/wordprocessingCanvas" xmlns:cx="http://schemas.microsoft.com/office/drawing/2014/chartex" xmlns:cx1="http://schemas.microsoft.com/office/drawing/2015/9/8/chartex" xmlns:cx2="http://schemas.microsoft.com/office/drawing/2015/10/21/chartex" xmlns:cx3="http://schemas.microsoft.com/office/drawing/2016/5/9/chartex" xmlns:cx4="http://schemas.microsoft.com/office/drawing/2016/5/10/chartex" xmlns:cx5="http://schemas.microsoft.com/office/drawing/2016/5/11/chartex" xmlns:cx6="http://schemas.microsoft.com/office/drawing/2016/5/12/chartex" xmlns:cx7="http://schemas.microsoft.com/office/drawing/2016/5/13/chartex" xmlns:cx8="http://schemas.microsoft.com/office/drawing/2016/5/14/chartex" xmlns:mc="http://schemas.openxmlformats.org/markup-compatibility/2006" xmlns:aink="http://schemas.microsoft.com/office/drawing/2016/ink" xmlns:am3d="http://schemas.microsoft.com/office/drawing/2017/model3d" xmlns:o="urn:schemas-microsoft-com:office:office" xmlns:oel="http://schemas.microsoft.com/office/2019/extlst" xmlns:r="http://schemas.openxmlformats.org/officeDocument/2006/relationships" xmlns:m="http://schemas.openxmlformats.org/officeDocument/2006/math" xmlns:v="urn:schemas-microsoft-com:vml" xmlns:wp14="http://schemas.microsoft.com/office/word/2010/wordprocessingDrawing" xmlns:wp="http://schemas.openxmlformats.org/drawingml/2006/wordprocessingDrawing" xmlns:w10="urn:schemas-microsoft-com:office:word" xmlns:w="http://schemas.openxmlformats.org/wordprocessingml/2006/main" xmlns:w14="http://schemas.microsoft.com/office/word/2010/wordml" xmlns:w15="http://schemas.microsoft.com/office/word/2012/wordml" xmlns:w16cex="http://schemas.microsoft.com/office/word/2018/wordml/cex" xmlns:w16cid="http://schemas.microsoft.com/office/word/2016/wordml/cid" xmlns:w16="http://schemas.microsoft.com/office/word/2018/wordml" xmlns:w16du="http://schemas.microsoft.com/office/word/2023/wordml/word16du" xmlns:w16sdtdh="http://schemas.microsoft.com/office/word/2020/wordml/sdtdatahash" xmlns:w16sdtfl="http://schemas.microsoft.com/office/word/2024/wordml/sdtformatlock" xmlns:w16se="http://schemas.microsoft.com/office/word/2015/wordml/symex" xmlns:wpg="http://schemas.microsoft.com/office/word/2010/wordprocessingGroup" xmlns:wpi="http://schemas.microsoft.com/office/word/2010/wordprocessingInk" xmlns:wne="http://schemas.microsoft.com/office/word/2006/wordml" xmlns:wps="http://schemas.microsoft.com/office/word/2010/wordprocessingShape" mc:Ignorable="w14 w15 w16se w16cid w16 w16cex w16sdtdh w16sdtfl w16du wp14">
   <w:p>
     <w:pPr>
       <w:pStyle w:val="Title"/>
@@ -2487,7 +2653,7 @@
 </file>
 
 <file path=word/header3.xml><?xml version="1.0" encoding="utf-8"?>
-<w:hdr xmlns:wpc="http://schemas.microsoft.com/office/word/2010/wordprocessingCanvas" xmlns:cx="http://schemas.microsoft.com/office/drawing/2014/chartex" xmlns:cx1="http://schemas.microsoft.com/office/drawing/2015/9/8/chartex" xmlns:cx2="http://schemas.microsoft.com/office/drawing/2015/10/21/chartex" xmlns:cx3="http://schemas.microsoft.com/office/drawing/2016/5/9/chartex" xmlns:cx4="http://schemas.microsoft.com/office/drawing/2016/5/10/chartex" xmlns:cx5="http://schemas.microsoft.com/office/drawing/2016/5/11/chartex" xmlns:cx6="http://schemas.microsoft.com/office/drawing/2016/5/12/chartex" xmlns:cx7="http://schemas.microsoft.com/office/drawing/2016/5/13/chartex" xmlns:cx8="http://schemas.microsoft.com/office/drawing/2016/5/14/chartex" xmlns:mc="http://schemas.openxmlformats.org/markup-compatibility/2006" xmlns:aink="http://schemas.microsoft.com/office/drawing/2016/ink" xmlns:am3d="http://schemas.microsoft.com/office/drawing/2017/model3d" xmlns:o="urn:schemas-microsoft-com:office:office" xmlns:oel="http://schemas.microsoft.com/office/2019/extlst" xmlns:r="http://schemas.openxmlformats.org/officeDocument/2006/relationships" xmlns:m="http://schemas.openxmlformats.org/officeDocument/2006/math" xmlns:v="urn:schemas-microsoft-com:vml" xmlns:wp14="http://schemas.microsoft.com/office/word/2010/wordprocessingDrawing" xmlns:wp="http://schemas.openxmlformats.org/drawingml/2006/wordprocessingDrawing" xmlns:w10="urn:schemas-microsoft-com:office:word" xmlns:w="http://schemas.openxmlformats.org/wordprocessingml/2006/main" xmlns:w14="http://schemas.microsoft.com/office/word/2010/wordml" xmlns:w15="http://schemas.microsoft.com/office/word/2012/wordml" xmlns:w16cex="http://schemas.microsoft.com/office/word/2018/wordml/cex" xmlns:w16cid="http://schemas.microsoft.com/office/word/2016/wordml/cid" xmlns:w16="http://schemas.microsoft.com/office/word/2018/wordml" xmlns:w16du="http://schemas.microsoft.com/office/word/2023/wordml/word16du" xmlns:w16sdtdh="http://schemas.microsoft.com/office/word/2020/wordml/sdtdatahash" xmlns:w16se="http://schemas.microsoft.com/office/word/2015/wordml/symex" xmlns:wpg="http://schemas.microsoft.com/office/word/2010/wordprocessingGroup" xmlns:wpi="http://schemas.microsoft.com/office/word/2010/wordprocessingInk" xmlns:wne="http://schemas.microsoft.com/office/word/2006/wordml" xmlns:wps="http://schemas.microsoft.com/office/word/2010/wordprocessingShape" mc:Ignorable="w14 w15 w16se w16cid w16 w16cex w16sdtdh w16du wp14">
+<w:hdr xmlns:wpc="http://schemas.microsoft.com/office/word/2010/wordprocessingCanvas" xmlns:cx="http://schemas.microsoft.com/office/drawing/2014/chartex" xmlns:cx1="http://schemas.microsoft.com/office/drawing/2015/9/8/chartex" xmlns:cx2="http://schemas.microsoft.com/office/drawing/2015/10/21/chartex" xmlns:cx3="http://schemas.microsoft.com/office/drawing/2016/5/9/chartex" xmlns:cx4="http://schemas.microsoft.com/office/drawing/2016/5/10/chartex" xmlns:cx5="http://schemas.microsoft.com/office/drawing/2016/5/11/chartex" xmlns:cx6="http://schemas.microsoft.com/office/drawing/2016/5/12/chartex" xmlns:cx7="http://schemas.microsoft.com/office/drawing/2016/5/13/chartex" xmlns:cx8="http://schemas.microsoft.com/office/drawing/2016/5/14/chartex" xmlns:mc="http://schemas.openxmlformats.org/markup-compatibility/2006" xmlns:aink="http://schemas.microsoft.com/office/drawing/2016/ink" xmlns:am3d="http://schemas.microsoft.com/office/drawing/2017/model3d" xmlns:o="urn:schemas-microsoft-com:office:office" xmlns:oel="http://schemas.microsoft.com/office/2019/extlst" xmlns:r="http://schemas.openxmlformats.org/officeDocument/2006/relationships" xmlns:m="http://schemas.openxmlformats.org/officeDocument/2006/math" xmlns:v="urn:schemas-microsoft-com:vml" xmlns:wp14="http://schemas.microsoft.com/office/word/2010/wordprocessingDrawing" xmlns:wp="http://schemas.openxmlformats.org/drawingml/2006/wordprocessingDrawing" xmlns:w10="urn:schemas-microsoft-com:office:word" xmlns:w="http://schemas.openxmlformats.org/wordprocessingml/2006/main" xmlns:w14="http://schemas.microsoft.com/office/word/2010/wordml" xmlns:w15="http://schemas.microsoft.com/office/word/2012/wordml" xmlns:w16cex="http://schemas.microsoft.com/office/word/2018/wordml/cex" xmlns:w16cid="http://schemas.microsoft.com/office/word/2016/wordml/cid" xmlns:w16="http://schemas.microsoft.com/office/word/2018/wordml" xmlns:w16du="http://schemas.microsoft.com/office/word/2023/wordml/word16du" xmlns:w16sdtdh="http://schemas.microsoft.com/office/word/2020/wordml/sdtdatahash" xmlns:w16sdtfl="http://schemas.microsoft.com/office/word/2024/wordml/sdtformatlock" xmlns:w16se="http://schemas.microsoft.com/office/word/2015/wordml/symex" xmlns:wpg="http://schemas.microsoft.com/office/word/2010/wordprocessingGroup" xmlns:wpi="http://schemas.microsoft.com/office/word/2010/wordprocessingInk" xmlns:wne="http://schemas.microsoft.com/office/word/2006/wordml" xmlns:wps="http://schemas.microsoft.com/office/word/2010/wordprocessingShape" mc:Ignorable="w14 w15 w16se w16cid w16 w16cex w16sdtdh w16sdtfl w16du wp14">
   <w:p>
     <w:pPr>
       <w:pStyle w:val="Header"/>
@@ -2515,7 +2681,7 @@
 </file>
 
 <file path=word/header4.xml><?xml version="1.0" encoding="utf-8"?>
-<w:hdr xmlns:wpc="http://schemas.microsoft.com/office/word/2010/wordprocessingCanvas" xmlns:cx="http://schemas.microsoft.com/office/drawing/2014/chartex" xmlns:cx1="http://schemas.microsoft.com/office/drawing/2015/9/8/chartex" xmlns:cx2="http://schemas.microsoft.com/office/drawing/2015/10/21/chartex" xmlns:cx3="http://schemas.microsoft.com/office/drawing/2016/5/9/chartex" xmlns:cx4="http://schemas.microsoft.com/office/drawing/2016/5/10/chartex" xmlns:cx5="http://schemas.microsoft.com/office/drawing/2016/5/11/chartex" xmlns:cx6="http://schemas.microsoft.com/office/drawing/2016/5/12/chartex" xmlns:cx7="http://schemas.microsoft.com/office/drawing/2016/5/13/chartex" xmlns:cx8="http://schemas.microsoft.com/office/drawing/2016/5/14/chartex" xmlns:mc="http://schemas.openxmlformats.org/markup-compatibility/2006" xmlns:aink="http://schemas.microsoft.com/office/drawing/2016/ink" xmlns:am3d="http://schemas.microsoft.com/office/drawing/2017/model3d" xmlns:o="urn:schemas-microsoft-com:office:office" xmlns:oel="http://schemas.microsoft.com/office/2019/extlst" xmlns:r="http://schemas.openxmlformats.org/officeDocument/2006/relationships" xmlns:m="http://schemas.openxmlformats.org/officeDocument/2006/math" xmlns:v="urn:schemas-microsoft-com:vml" xmlns:wp14="http://schemas.microsoft.com/office/word/2010/wordprocessingDrawing" xmlns:wp="http://schemas.openxmlformats.org/drawingml/2006/wordprocessingDrawing" xmlns:w10="urn:schemas-microsoft-com:office:word" xmlns:w="http://schemas.openxmlformats.org/wordprocessingml/2006/main" xmlns:w14="http://schemas.microsoft.com/office/word/2010/wordml" xmlns:w15="http://schemas.microsoft.com/office/word/2012/wordml" xmlns:w16cex="http://schemas.microsoft.com/office/word/2018/wordml/cex" xmlns:w16cid="http://schemas.microsoft.com/office/word/2016/wordml/cid" xmlns:w16="http://schemas.microsoft.com/office/word/2018/wordml" xmlns:w16du="http://schemas.microsoft.com/office/word/2023/wordml/word16du" xmlns:w16sdtdh="http://schemas.microsoft.com/office/word/2020/wordml/sdtdatahash" xmlns:w16se="http://schemas.microsoft.com/office/word/2015/wordml/symex" xmlns:wpg="http://schemas.microsoft.com/office/word/2010/wordprocessingGroup" xmlns:wpi="http://schemas.microsoft.com/office/word/2010/wordprocessingInk" xmlns:wne="http://schemas.microsoft.com/office/word/2006/wordml" xmlns:wps="http://schemas.microsoft.com/office/word/2010/wordprocessingShape" mc:Ignorable="w14 w15 w16se w16cid w16 w16cex w16sdtdh w16du wp14">
+<w:hdr xmlns:wpc="http://schemas.microsoft.com/office/word/2010/wordprocessingCanvas" xmlns:cx="http://schemas.microsoft.com/office/drawing/2014/chartex" xmlns:cx1="http://schemas.microsoft.com/office/drawing/2015/9/8/chartex" xmlns:cx2="http://schemas.microsoft.com/office/drawing/2015/10/21/chartex" xmlns:cx3="http://schemas.microsoft.com/office/drawing/2016/5/9/chartex" xmlns:cx4="http://schemas.microsoft.com/office/drawing/2016/5/10/chartex" xmlns:cx5="http://schemas.microsoft.com/office/drawing/2016/5/11/chartex" xmlns:cx6="http://schemas.microsoft.com/office/drawing/2016/5/12/chartex" xmlns:cx7="http://schemas.microsoft.com/office/drawing/2016/5/13/chartex" xmlns:cx8="http://schemas.microsoft.com/office/drawing/2016/5/14/chartex" xmlns:mc="http://schemas.openxmlformats.org/markup-compatibility/2006" xmlns:aink="http://schemas.microsoft.com/office/drawing/2016/ink" xmlns:am3d="http://schemas.microsoft.com/office/drawing/2017/model3d" xmlns:o="urn:schemas-microsoft-com:office:office" xmlns:oel="http://schemas.microsoft.com/office/2019/extlst" xmlns:r="http://schemas.openxmlformats.org/officeDocument/2006/relationships" xmlns:m="http://schemas.openxmlformats.org/officeDocument/2006/math" xmlns:v="urn:schemas-microsoft-com:vml" xmlns:wp14="http://schemas.microsoft.com/office/word/2010/wordprocessingDrawing" xmlns:wp="http://schemas.openxmlformats.org/drawingml/2006/wordprocessingDrawing" xmlns:w10="urn:schemas-microsoft-com:office:word" xmlns:w="http://schemas.openxmlformats.org/wordprocessingml/2006/main" xmlns:w14="http://schemas.microsoft.com/office/word/2010/wordml" xmlns:w15="http://schemas.microsoft.com/office/word/2012/wordml" xmlns:w16cex="http://schemas.microsoft.com/office/word/2018/wordml/cex" xmlns:w16cid="http://schemas.microsoft.com/office/word/2016/wordml/cid" xmlns:w16="http://schemas.microsoft.com/office/word/2018/wordml" xmlns:w16du="http://schemas.microsoft.com/office/word/2023/wordml/word16du" xmlns:w16sdtdh="http://schemas.microsoft.com/office/word/2020/wordml/sdtdatahash" xmlns:w16sdtfl="http://schemas.microsoft.com/office/word/2024/wordml/sdtformatlock" xmlns:w16se="http://schemas.microsoft.com/office/word/2015/wordml/symex" xmlns:wpg="http://schemas.microsoft.com/office/word/2010/wordprocessingGroup" xmlns:wpi="http://schemas.microsoft.com/office/word/2010/wordprocessingInk" xmlns:wne="http://schemas.microsoft.com/office/word/2006/wordml" xmlns:wps="http://schemas.microsoft.com/office/word/2010/wordprocessingShape" mc:Ignorable="w14 w15 w16se w16cid w16 w16cex w16sdtdh w16sdtfl w16du wp14">
   <w:p>
     <w:pPr>
       <w:pStyle w:val="Title"/>
@@ -2625,7 +2791,7 @@
 </file>
 
 <file path=word/header5.xml><?xml version="1.0" encoding="utf-8"?>
-<w:hdr xmlns:wpc="http://schemas.microsoft.com/office/word/2010/wordprocessingCanvas" xmlns:cx="http://schemas.microsoft.com/office/drawing/2014/chartex" xmlns:cx1="http://schemas.microsoft.com/office/drawing/2015/9/8/chartex" xmlns:cx2="http://schemas.microsoft.com/office/drawing/2015/10/21/chartex" xmlns:cx3="http://schemas.microsoft.com/office/drawing/2016/5/9/chartex" xmlns:cx4="http://schemas.microsoft.com/office/drawing/2016/5/10/chartex" xmlns:cx5="http://schemas.microsoft.com/office/drawing/2016/5/11/chartex" xmlns:cx6="http://schemas.microsoft.com/office/drawing/2016/5/12/chartex" xmlns:cx7="http://schemas.microsoft.com/office/drawing/2016/5/13/chartex" xmlns:cx8="http://schemas.microsoft.com/office/drawing/2016/5/14/chartex" xmlns:mc="http://schemas.openxmlformats.org/markup-compatibility/2006" xmlns:aink="http://schemas.microsoft.com/office/drawing/2016/ink" xmlns:am3d="http://schemas.microsoft.com/office/drawing/2017/model3d" xmlns:o="urn:schemas-microsoft-com:office:office" xmlns:oel="http://schemas.microsoft.com/office/2019/extlst" xmlns:r="http://schemas.openxmlformats.org/officeDocument/2006/relationships" xmlns:m="http://schemas.openxmlformats.org/officeDocument/2006/math" xmlns:v="urn:schemas-microsoft-com:vml" xmlns:wp14="http://schemas.microsoft.com/office/word/2010/wordprocessingDrawing" xmlns:wp="http://schemas.openxmlformats.org/drawingml/2006/wordprocessingDrawing" xmlns:w10="urn:schemas-microsoft-com:office:word" xmlns:w="http://schemas.openxmlformats.org/wordprocessingml/2006/main" xmlns:w14="http://schemas.microsoft.com/office/word/2010/wordml" xmlns:w15="http://schemas.microsoft.com/office/word/2012/wordml" xmlns:w16cex="http://schemas.microsoft.com/office/word/2018/wordml/cex" xmlns:w16cid="http://schemas.microsoft.com/office/word/2016/wordml/cid" xmlns:w16="http://schemas.microsoft.com/office/word/2018/wordml" xmlns:w16du="http://schemas.microsoft.com/office/word/2023/wordml/word16du" xmlns:w16sdtdh="http://schemas.microsoft.com/office/word/2020/wordml/sdtdatahash" xmlns:w16se="http://schemas.microsoft.com/office/word/2015/wordml/symex" xmlns:wpg="http://schemas.microsoft.com/office/word/2010/wordprocessingGroup" xmlns:wpi="http://schemas.microsoft.com/office/word/2010/wordprocessingInk" xmlns:wne="http://schemas.microsoft.com/office/word/2006/wordml" xmlns:wps="http://schemas.microsoft.com/office/word/2010/wordprocessingShape" mc:Ignorable="w14 w15 w16se w16cid w16 w16cex w16sdtdh w16du wp14">
+<w:hdr xmlns:wpc="http://schemas.microsoft.com/office/word/2010/wordprocessingCanvas" xmlns:cx="http://schemas.microsoft.com/office/drawing/2014/chartex" xmlns:cx1="http://schemas.microsoft.com/office/drawing/2015/9/8/chartex" xmlns:cx2="http://schemas.microsoft.com/office/drawing/2015/10/21/chartex" xmlns:cx3="http://schemas.microsoft.com/office/drawing/2016/5/9/chartex" xmlns:cx4="http://schemas.microsoft.com/office/drawing/2016/5/10/chartex" xmlns:cx5="http://schemas.microsoft.com/office/drawing/2016/5/11/chartex" xmlns:cx6="http://schemas.microsoft.com/office/drawing/2016/5/12/chartex" xmlns:cx7="http://schemas.microsoft.com/office/drawing/2016/5/13/chartex" xmlns:cx8="http://schemas.microsoft.com/office/drawing/2016/5/14/chartex" xmlns:mc="http://schemas.openxmlformats.org/markup-compatibility/2006" xmlns:aink="http://schemas.microsoft.com/office/drawing/2016/ink" xmlns:am3d="http://schemas.microsoft.com/office/drawing/2017/model3d" xmlns:o="urn:schemas-microsoft-com:office:office" xmlns:oel="http://schemas.microsoft.com/office/2019/extlst" xmlns:r="http://schemas.openxmlformats.org/officeDocument/2006/relationships" xmlns:m="http://schemas.openxmlformats.org/officeDocument/2006/math" xmlns:v="urn:schemas-microsoft-com:vml" xmlns:wp14="http://schemas.microsoft.com/office/word/2010/wordprocessingDrawing" xmlns:wp="http://schemas.openxmlformats.org/drawingml/2006/wordprocessingDrawing" xmlns:w10="urn:schemas-microsoft-com:office:word" xmlns:w="http://schemas.openxmlformats.org/wordprocessingml/2006/main" xmlns:w14="http://schemas.microsoft.com/office/word/2010/wordml" xmlns:w15="http://schemas.microsoft.com/office/word/2012/wordml" xmlns:w16cex="http://schemas.microsoft.com/office/word/2018/wordml/cex" xmlns:w16cid="http://schemas.microsoft.com/office/word/2016/wordml/cid" xmlns:w16="http://schemas.microsoft.com/office/word/2018/wordml" xmlns:w16du="http://schemas.microsoft.com/office/word/2023/wordml/word16du" xmlns:w16sdtdh="http://schemas.microsoft.com/office/word/2020/wordml/sdtdatahash" xmlns:w16sdtfl="http://schemas.microsoft.com/office/word/2024/wordml/sdtformatlock" xmlns:w16se="http://schemas.microsoft.com/office/word/2015/wordml/symex" xmlns:wpg="http://schemas.microsoft.com/office/word/2010/wordprocessingGroup" xmlns:wpi="http://schemas.microsoft.com/office/word/2010/wordprocessingInk" xmlns:wne="http://schemas.microsoft.com/office/word/2006/wordml" xmlns:wps="http://schemas.microsoft.com/office/word/2010/wordprocessingShape" mc:Ignorable="w14 w15 w16se w16cid w16 w16cex w16sdtdh w16sdtfl w16du wp14">
   <w:p>
     <w:pPr>
       <w:pStyle w:val="Header"/>
@@ -2654,7 +2820,7 @@
 </file>
 
 <file path=word/numbering.xml><?xml version="1.0" encoding="utf-8"?>
-<w:numbering xmlns:wpc="http://schemas.microsoft.com/office/word/2010/wordprocessingCanvas" xmlns:cx="http://schemas.microsoft.com/office/drawing/2014/chartex" xmlns:cx1="http://schemas.microsoft.com/office/drawing/2015/9/8/chartex" xmlns:cx2="http://schemas.microsoft.com/office/drawing/2015/10/21/chartex" xmlns:cx3="http://schemas.microsoft.com/office/drawing/2016/5/9/chartex" xmlns:cx4="http://schemas.microsoft.com/office/drawing/2016/5/10/chartex" xmlns:cx5="http://schemas.microsoft.com/office/drawing/2016/5/11/chartex" xmlns:cx6="http://schemas.microsoft.com/office/drawing/2016/5/12/chartex" xmlns:cx7="http://schemas.microsoft.com/office/drawing/2016/5/13/chartex" xmlns:cx8="http://schemas.microsoft.com/office/drawing/2016/5/14/chartex" xmlns:mc="http://schemas.openxmlformats.org/markup-compatibility/2006" xmlns:aink="http://schemas.microsoft.com/office/drawing/2016/ink" xmlns:am3d="http://schemas.microsoft.com/office/drawing/2017/model3d" xmlns:o="urn:schemas-microsoft-com:office:office" xmlns:oel="http://schemas.microsoft.com/office/2019/extlst" xmlns:r="http://schemas.openxmlformats.org/officeDocument/2006/relationships" xmlns:m="http://schemas.openxmlformats.org/officeDocument/2006/math" xmlns:v="urn:schemas-microsoft-com:vml" xmlns:wp14="http://schemas.microsoft.com/office/word/2010/wordprocessingDrawing" xmlns:wp="http://schemas.openxmlformats.org/drawingml/2006/wordprocessingDrawing" xmlns:w10="urn:schemas-microsoft-com:office:word" xmlns:w="http://schemas.openxmlformats.org/wordprocessingml/2006/main" xmlns:w14="http://schemas.microsoft.com/office/word/2010/wordml" xmlns:w15="http://schemas.microsoft.com/office/word/2012/wordml" xmlns:w16cex="http://schemas.microsoft.com/office/word/2018/wordml/cex" xmlns:w16cid="http://schemas.microsoft.com/office/word/2016/wordml/cid" xmlns:w16="http://schemas.microsoft.com/office/word/2018/wordml" xmlns:w16du="http://schemas.microsoft.com/office/word/2023/wordml/word16du" xmlns:w16sdtdh="http://schemas.microsoft.com/office/word/2020/wordml/sdtdatahash" xmlns:w16se="http://schemas.microsoft.com/office/word/2015/wordml/symex" xmlns:wpg="http://schemas.microsoft.com/office/word/2010/wordprocessingGroup" xmlns:wpi="http://schemas.microsoft.com/office/word/2010/wordprocessingInk" xmlns:wne="http://schemas.microsoft.com/office/word/2006/wordml" xmlns:wps="http://schemas.microsoft.com/office/word/2010/wordprocessingShape" mc:Ignorable="w14 w15 w16se w16cid w16 w16cex w16sdtdh w16du wp14">
+<w:numbering xmlns:wpc="http://schemas.microsoft.com/office/word/2010/wordprocessingCanvas" xmlns:cx="http://schemas.microsoft.com/office/drawing/2014/chartex" xmlns:cx1="http://schemas.microsoft.com/office/drawing/2015/9/8/chartex" xmlns:cx2="http://schemas.microsoft.com/office/drawing/2015/10/21/chartex" xmlns:cx3="http://schemas.microsoft.com/office/drawing/2016/5/9/chartex" xmlns:cx4="http://schemas.microsoft.com/office/drawing/2016/5/10/chartex" xmlns:cx5="http://schemas.microsoft.com/office/drawing/2016/5/11/chartex" xmlns:cx6="http://schemas.microsoft.com/office/drawing/2016/5/12/chartex" xmlns:cx7="http://schemas.microsoft.com/office/drawing/2016/5/13/chartex" xmlns:cx8="http://schemas.microsoft.com/office/drawing/2016/5/14/chartex" xmlns:mc="http://schemas.openxmlformats.org/markup-compatibility/2006" xmlns:aink="http://schemas.microsoft.com/office/drawing/2016/ink" xmlns:am3d="http://schemas.microsoft.com/office/drawing/2017/model3d" xmlns:o="urn:schemas-microsoft-com:office:office" xmlns:oel="http://schemas.microsoft.com/office/2019/extlst" xmlns:r="http://schemas.openxmlformats.org/officeDocument/2006/relationships" xmlns:m="http://schemas.openxmlformats.org/officeDocument/2006/math" xmlns:v="urn:schemas-microsoft-com:vml" xmlns:wp14="http://schemas.microsoft.com/office/word/2010/wordprocessingDrawing" xmlns:wp="http://schemas.openxmlformats.org/drawingml/2006/wordprocessingDrawing" xmlns:w10="urn:schemas-microsoft-com:office:word" xmlns:w="http://schemas.openxmlformats.org/wordprocessingml/2006/main" xmlns:w14="http://schemas.microsoft.com/office/word/2010/wordml" xmlns:w15="http://schemas.microsoft.com/office/word/2012/wordml" xmlns:w16cex="http://schemas.microsoft.com/office/word/2018/wordml/cex" xmlns:w16cid="http://schemas.microsoft.com/office/word/2016/wordml/cid" xmlns:w16="http://schemas.microsoft.com/office/word/2018/wordml" xmlns:w16du="http://schemas.microsoft.com/office/word/2023/wordml/word16du" xmlns:w16sdtdh="http://schemas.microsoft.com/office/word/2020/wordml/sdtdatahash" xmlns:w16sdtfl="http://schemas.microsoft.com/office/word/2024/wordml/sdtformatlock" xmlns:w16se="http://schemas.microsoft.com/office/word/2015/wordml/symex" xmlns:wpg="http://schemas.microsoft.com/office/word/2010/wordprocessingGroup" xmlns:wpi="http://schemas.microsoft.com/office/word/2010/wordprocessingInk" xmlns:wne="http://schemas.microsoft.com/office/word/2006/wordml" xmlns:wps="http://schemas.microsoft.com/office/word/2010/wordprocessingShape" mc:Ignorable="w14 w15 w16se w16cid w16 w16cex w16sdtdh w16sdtfl w16du wp14">
   <w:abstractNum w:abstractNumId="0" w15:restartNumberingAfterBreak="0">
     <w:nsid w:val="025C288F"/>
     <w:multiLevelType w:val="hybridMultilevel"/>
@@ -2995,6 +3161,119 @@
     </w:lvl>
   </w:abstractNum>
   <w:abstractNum w:abstractNumId="3" w15:restartNumberingAfterBreak="0">
+    <w:nsid w:val="227B146A"/>
+    <w:multiLevelType w:val="hybridMultilevel"/>
+    <w:tmpl w:val="D9FAC948"/>
+    <w:lvl w:ilvl="0" w:tplc="04090001">
+      <w:start w:val="1"/>
+      <w:numFmt w:val="bullet"/>
+      <w:lvlText w:val=""/>
+      <w:lvlJc w:val="left"/>
+      <w:pPr>
+        <w:ind w:left="720" w:hanging="360"/>
+      </w:pPr>
+      <w:rPr>
+        <w:rFonts w:ascii="Symbol" w:hAnsi="Symbol" w:hint="default"/>
+      </w:rPr>
+    </w:lvl>
+    <w:lvl w:ilvl="1" w:tplc="04090003" w:tentative="1">
+      <w:start w:val="1"/>
+      <w:numFmt w:val="bullet"/>
+      <w:lvlText w:val="o"/>
+      <w:lvlJc w:val="left"/>
+      <w:pPr>
+        <w:ind w:left="1440" w:hanging="360"/>
+      </w:pPr>
+      <w:rPr>
+        <w:rFonts w:ascii="Courier New" w:hAnsi="Courier New" w:cs="Courier New" w:hint="default"/>
+      </w:rPr>
+    </w:lvl>
+    <w:lvl w:ilvl="2" w:tplc="04090005" w:tentative="1">
+      <w:start w:val="1"/>
+      <w:numFmt w:val="bullet"/>
+      <w:lvlText w:val=""/>
+      <w:lvlJc w:val="left"/>
+      <w:pPr>
+        <w:ind w:left="2160" w:hanging="360"/>
+      </w:pPr>
+      <w:rPr>
+        <w:rFonts w:ascii="Wingdings" w:hAnsi="Wingdings" w:hint="default"/>
+      </w:rPr>
+    </w:lvl>
+    <w:lvl w:ilvl="3" w:tplc="04090001" w:tentative="1">
+      <w:start w:val="1"/>
+      <w:numFmt w:val="bullet"/>
+      <w:lvlText w:val=""/>
+      <w:lvlJc w:val="left"/>
+      <w:pPr>
+        <w:ind w:left="2880" w:hanging="360"/>
+      </w:pPr>
+      <w:rPr>
+        <w:rFonts w:ascii="Symbol" w:hAnsi="Symbol" w:hint="default"/>
+      </w:rPr>
+    </w:lvl>
+    <w:lvl w:ilvl="4" w:tplc="04090003" w:tentative="1">
+      <w:start w:val="1"/>
+      <w:numFmt w:val="bullet"/>
+      <w:lvlText w:val="o"/>
+      <w:lvlJc w:val="left"/>
+      <w:pPr>
+        <w:ind w:left="3600" w:hanging="360"/>
+      </w:pPr>
+      <w:rPr>
+        <w:rFonts w:ascii="Courier New" w:hAnsi="Courier New" w:cs="Courier New" w:hint="default"/>
+      </w:rPr>
+    </w:lvl>
+    <w:lvl w:ilvl="5" w:tplc="04090005" w:tentative="1">
+      <w:start w:val="1"/>
+      <w:numFmt w:val="bullet"/>
+      <w:lvlText w:val=""/>
+      <w:lvlJc w:val="left"/>
+      <w:pPr>
+        <w:ind w:left="4320" w:hanging="360"/>
+      </w:pPr>
+      <w:rPr>
+        <w:rFonts w:ascii="Wingdings" w:hAnsi="Wingdings" w:hint="default"/>
+      </w:rPr>
+    </w:lvl>
+    <w:lvl w:ilvl="6" w:tplc="04090001" w:tentative="1">
+      <w:start w:val="1"/>
+      <w:numFmt w:val="bullet"/>
+      <w:lvlText w:val=""/>
+      <w:lvlJc w:val="left"/>
+      <w:pPr>
+        <w:ind w:left="5040" w:hanging="360"/>
+      </w:pPr>
+      <w:rPr>
+        <w:rFonts w:ascii="Symbol" w:hAnsi="Symbol" w:hint="default"/>
+      </w:rPr>
+    </w:lvl>
+    <w:lvl w:ilvl="7" w:tplc="04090003" w:tentative="1">
+      <w:start w:val="1"/>
+      <w:numFmt w:val="bullet"/>
+      <w:lvlText w:val="o"/>
+      <w:lvlJc w:val="left"/>
+      <w:pPr>
+        <w:ind w:left="5760" w:hanging="360"/>
+      </w:pPr>
+      <w:rPr>
+        <w:rFonts w:ascii="Courier New" w:hAnsi="Courier New" w:cs="Courier New" w:hint="default"/>
+      </w:rPr>
+    </w:lvl>
+    <w:lvl w:ilvl="8" w:tplc="04090005" w:tentative="1">
+      <w:start w:val="1"/>
+      <w:numFmt w:val="bullet"/>
+      <w:lvlText w:val=""/>
+      <w:lvlJc w:val="left"/>
+      <w:pPr>
+        <w:ind w:left="6480" w:hanging="360"/>
+      </w:pPr>
+      <w:rPr>
+        <w:rFonts w:ascii="Wingdings" w:hAnsi="Wingdings" w:hint="default"/>
+      </w:rPr>
+    </w:lvl>
+  </w:abstractNum>
+  <w:abstractNum w:abstractNumId="4" w15:restartNumberingAfterBreak="0">
     <w:nsid w:val="235F2E63"/>
     <w:multiLevelType w:val="hybridMultilevel"/>
     <w:tmpl w:val="8FC01B02"/>
@@ -3107,7 +3386,7 @@
       </w:rPr>
     </w:lvl>
   </w:abstractNum>
-  <w:abstractNum w:abstractNumId="4" w15:restartNumberingAfterBreak="0">
+  <w:abstractNum w:abstractNumId="5" w15:restartNumberingAfterBreak="0">
     <w:nsid w:val="255015A0"/>
     <w:multiLevelType w:val="multilevel"/>
     <w:tmpl w:val="BAB66D1E"/>
@@ -3224,7 +3503,7 @@
       </w:pPr>
     </w:lvl>
   </w:abstractNum>
-  <w:abstractNum w:abstractNumId="5" w15:restartNumberingAfterBreak="0">
+  <w:abstractNum w:abstractNumId="6" w15:restartNumberingAfterBreak="0">
     <w:nsid w:val="28806360"/>
     <w:multiLevelType w:val="hybridMultilevel"/>
     <w:tmpl w:val="3F088402"/>
@@ -3337,7 +3616,7 @@
       </w:rPr>
     </w:lvl>
   </w:abstractNum>
-  <w:abstractNum w:abstractNumId="6" w15:restartNumberingAfterBreak="0">
+  <w:abstractNum w:abstractNumId="7" w15:restartNumberingAfterBreak="0">
     <w:nsid w:val="2D6F2F02"/>
     <w:multiLevelType w:val="hybridMultilevel"/>
     <w:tmpl w:val="4EA20B26"/>
@@ -3450,7 +3729,7 @@
       </w:rPr>
     </w:lvl>
   </w:abstractNum>
-  <w:abstractNum w:abstractNumId="7" w15:restartNumberingAfterBreak="0">
+  <w:abstractNum w:abstractNumId="8" w15:restartNumberingAfterBreak="0">
     <w:nsid w:val="33256278"/>
     <w:multiLevelType w:val="hybridMultilevel"/>
     <w:tmpl w:val="8C88D8A0"/>
@@ -3563,7 +3842,7 @@
       </w:rPr>
     </w:lvl>
   </w:abstractNum>
-  <w:abstractNum w:abstractNumId="8" w15:restartNumberingAfterBreak="0">
+  <w:abstractNum w:abstractNumId="9" w15:restartNumberingAfterBreak="0">
     <w:nsid w:val="3436287A"/>
     <w:multiLevelType w:val="hybridMultilevel"/>
     <w:tmpl w:val="F4307600"/>
@@ -3676,7 +3955,7 @@
       </w:rPr>
     </w:lvl>
   </w:abstractNum>
-  <w:abstractNum w:abstractNumId="9" w15:restartNumberingAfterBreak="0">
+  <w:abstractNum w:abstractNumId="10" w15:restartNumberingAfterBreak="0">
     <w:nsid w:val="364F384D"/>
     <w:multiLevelType w:val="hybridMultilevel"/>
     <w:tmpl w:val="11BA6786"/>
@@ -3818,7 +4097,7 @@
       </w:rPr>
     </w:lvl>
   </w:abstractNum>
-  <w:abstractNum w:abstractNumId="10" w15:restartNumberingAfterBreak="0">
+  <w:abstractNum w:abstractNumId="11" w15:restartNumberingAfterBreak="0">
     <w:nsid w:val="3BB258EE"/>
     <w:multiLevelType w:val="hybridMultilevel"/>
     <w:tmpl w:val="D438FAAE"/>
@@ -3931,7 +4210,7 @@
       </w:rPr>
     </w:lvl>
   </w:abstractNum>
-  <w:abstractNum w:abstractNumId="11" w15:restartNumberingAfterBreak="0">
+  <w:abstractNum w:abstractNumId="12" w15:restartNumberingAfterBreak="0">
     <w:nsid w:val="472066D5"/>
     <w:multiLevelType w:val="hybridMultilevel"/>
     <w:tmpl w:val="C938F9D4"/>
@@ -4044,7 +4323,7 @@
       </w:rPr>
     </w:lvl>
   </w:abstractNum>
-  <w:abstractNum w:abstractNumId="12" w15:restartNumberingAfterBreak="0">
+  <w:abstractNum w:abstractNumId="13" w15:restartNumberingAfterBreak="0">
     <w:nsid w:val="4C1D434C"/>
     <w:multiLevelType w:val="hybridMultilevel"/>
     <w:tmpl w:val="DD14FC5C"/>
@@ -4157,7 +4436,7 @@
       </w:rPr>
     </w:lvl>
   </w:abstractNum>
-  <w:abstractNum w:abstractNumId="13" w15:restartNumberingAfterBreak="0">
+  <w:abstractNum w:abstractNumId="14" w15:restartNumberingAfterBreak="0">
     <w:nsid w:val="52CA5E70"/>
     <w:multiLevelType w:val="hybridMultilevel"/>
     <w:tmpl w:val="769481C2"/>
@@ -4270,7 +4549,7 @@
       </w:rPr>
     </w:lvl>
   </w:abstractNum>
-  <w:abstractNum w:abstractNumId="14" w15:restartNumberingAfterBreak="0">
+  <w:abstractNum w:abstractNumId="15" w15:restartNumberingAfterBreak="0">
     <w:nsid w:val="536F03D5"/>
     <w:multiLevelType w:val="hybridMultilevel"/>
     <w:tmpl w:val="C268A858"/>
@@ -4383,7 +4662,7 @@
       </w:rPr>
     </w:lvl>
   </w:abstractNum>
-  <w:abstractNum w:abstractNumId="15" w15:restartNumberingAfterBreak="0">
+  <w:abstractNum w:abstractNumId="16" w15:restartNumberingAfterBreak="0">
     <w:nsid w:val="5C002BEA"/>
     <w:multiLevelType w:val="hybridMultilevel"/>
     <w:tmpl w:val="FBCC55C6"/>
@@ -4496,7 +4775,7 @@
       </w:rPr>
     </w:lvl>
   </w:abstractNum>
-  <w:abstractNum w:abstractNumId="16" w15:restartNumberingAfterBreak="0">
+  <w:abstractNum w:abstractNumId="17" w15:restartNumberingAfterBreak="0">
     <w:nsid w:val="5E791B38"/>
     <w:multiLevelType w:val="multilevel"/>
     <w:tmpl w:val="C40CABFE"/>
@@ -4645,7 +4924,7 @@
       </w:rPr>
     </w:lvl>
   </w:abstractNum>
-  <w:abstractNum w:abstractNumId="17" w15:restartNumberingAfterBreak="0">
+  <w:abstractNum w:abstractNumId="18" w15:restartNumberingAfterBreak="0">
     <w:nsid w:val="6016668D"/>
     <w:multiLevelType w:val="hybridMultilevel"/>
     <w:tmpl w:val="16E811C6"/>
@@ -4758,7 +5037,7 @@
       </w:rPr>
     </w:lvl>
   </w:abstractNum>
-  <w:abstractNum w:abstractNumId="18" w15:restartNumberingAfterBreak="0">
+  <w:abstractNum w:abstractNumId="19" w15:restartNumberingAfterBreak="0">
     <w:nsid w:val="621C1A16"/>
     <w:multiLevelType w:val="hybridMultilevel"/>
     <w:tmpl w:val="E9DEA9AC"/>
@@ -4871,7 +5150,7 @@
       </w:rPr>
     </w:lvl>
   </w:abstractNum>
-  <w:abstractNum w:abstractNumId="19" w15:restartNumberingAfterBreak="0">
+  <w:abstractNum w:abstractNumId="20" w15:restartNumberingAfterBreak="0">
     <w:nsid w:val="694A7B46"/>
     <w:multiLevelType w:val="hybridMultilevel"/>
     <w:tmpl w:val="E53E2D52"/>
@@ -4984,7 +5263,7 @@
       </w:rPr>
     </w:lvl>
   </w:abstractNum>
-  <w:abstractNum w:abstractNumId="20" w15:restartNumberingAfterBreak="0">
+  <w:abstractNum w:abstractNumId="21" w15:restartNumberingAfterBreak="0">
     <w:nsid w:val="69803023"/>
     <w:multiLevelType w:val="hybridMultilevel"/>
     <w:tmpl w:val="D8E8F602"/>
@@ -5097,7 +5376,7 @@
       </w:rPr>
     </w:lvl>
   </w:abstractNum>
-  <w:abstractNum w:abstractNumId="21" w15:restartNumberingAfterBreak="0">
+  <w:abstractNum w:abstractNumId="22" w15:restartNumberingAfterBreak="0">
     <w:nsid w:val="6A8D7D5F"/>
     <w:multiLevelType w:val="hybridMultilevel"/>
     <w:tmpl w:val="F8A21ED0"/>
@@ -5210,7 +5489,7 @@
       </w:rPr>
     </w:lvl>
   </w:abstractNum>
-  <w:abstractNum w:abstractNumId="22" w15:restartNumberingAfterBreak="0">
+  <w:abstractNum w:abstractNumId="23" w15:restartNumberingAfterBreak="0">
     <w:nsid w:val="72E80F3A"/>
     <w:multiLevelType w:val="hybridMultilevel"/>
     <w:tmpl w:val="B6E29A20"/>
@@ -5323,7 +5602,7 @@
       </w:rPr>
     </w:lvl>
   </w:abstractNum>
-  <w:abstractNum w:abstractNumId="23" w15:restartNumberingAfterBreak="0">
+  <w:abstractNum w:abstractNumId="24" w15:restartNumberingAfterBreak="0">
     <w:nsid w:val="74D6045B"/>
     <w:multiLevelType w:val="hybridMultilevel"/>
     <w:tmpl w:val="7C26621E"/>
@@ -5436,7 +5715,7 @@
       </w:rPr>
     </w:lvl>
   </w:abstractNum>
-  <w:abstractNum w:abstractNumId="24" w15:restartNumberingAfterBreak="0">
+  <w:abstractNum w:abstractNumId="25" w15:restartNumberingAfterBreak="0">
     <w:nsid w:val="7A7F400F"/>
     <w:multiLevelType w:val="multilevel"/>
     <w:tmpl w:val="8912D956"/>
@@ -5586,86 +5865,89 @@
     </w:lvl>
   </w:abstractNum>
   <w:num w:numId="1" w16cid:durableId="964894317">
-    <w:abstractNumId w:val="9"/>
+    <w:abstractNumId w:val="10"/>
   </w:num>
   <w:num w:numId="2" w16cid:durableId="1024405430">
-    <w:abstractNumId w:val="23"/>
+    <w:abstractNumId w:val="24"/>
   </w:num>
   <w:num w:numId="3" w16cid:durableId="377437929">
-    <w:abstractNumId w:val="10"/>
+    <w:abstractNumId w:val="11"/>
   </w:num>
   <w:num w:numId="4" w16cid:durableId="1847938324">
-    <w:abstractNumId w:val="13"/>
+    <w:abstractNumId w:val="14"/>
   </w:num>
   <w:num w:numId="5" w16cid:durableId="1181042138">
-    <w:abstractNumId w:val="17"/>
+    <w:abstractNumId w:val="18"/>
   </w:num>
   <w:num w:numId="6" w16cid:durableId="995449268">
-    <w:abstractNumId w:val="6"/>
+    <w:abstractNumId w:val="7"/>
   </w:num>
   <w:num w:numId="7" w16cid:durableId="261911650">
-    <w:abstractNumId w:val="14"/>
+    <w:abstractNumId w:val="15"/>
   </w:num>
   <w:num w:numId="8" w16cid:durableId="199393012">
-    <w:abstractNumId w:val="16"/>
+    <w:abstractNumId w:val="17"/>
   </w:num>
   <w:num w:numId="9" w16cid:durableId="576280619">
     <w:abstractNumId w:val="0"/>
   </w:num>
   <w:num w:numId="10" w16cid:durableId="991954140">
-    <w:abstractNumId w:val="15"/>
+    <w:abstractNumId w:val="16"/>
   </w:num>
   <w:num w:numId="11" w16cid:durableId="901872225">
     <w:abstractNumId w:val="1"/>
   </w:num>
   <w:num w:numId="12" w16cid:durableId="1683624998">
-    <w:abstractNumId w:val="20"/>
+    <w:abstractNumId w:val="21"/>
   </w:num>
   <w:num w:numId="13" w16cid:durableId="1320042635">
-    <w:abstractNumId w:val="11"/>
+    <w:abstractNumId w:val="12"/>
   </w:num>
   <w:num w:numId="14" w16cid:durableId="1984693884">
-    <w:abstractNumId w:val="18"/>
+    <w:abstractNumId w:val="19"/>
   </w:num>
   <w:num w:numId="15" w16cid:durableId="1903564083">
-    <w:abstractNumId w:val="21"/>
+    <w:abstractNumId w:val="22"/>
   </w:num>
   <w:num w:numId="16" w16cid:durableId="1237324601">
-    <w:abstractNumId w:val="8"/>
+    <w:abstractNumId w:val="9"/>
   </w:num>
   <w:num w:numId="17" w16cid:durableId="1699155546">
-    <w:abstractNumId w:val="12"/>
+    <w:abstractNumId w:val="13"/>
   </w:num>
   <w:num w:numId="18" w16cid:durableId="1258295484">
     <w:abstractNumId w:val="2"/>
   </w:num>
   <w:num w:numId="19" w16cid:durableId="1338001154">
-    <w:abstractNumId w:val="7"/>
+    <w:abstractNumId w:val="8"/>
   </w:num>
   <w:num w:numId="20" w16cid:durableId="2065370867">
-    <w:abstractNumId w:val="3"/>
+    <w:abstractNumId w:val="4"/>
   </w:num>
   <w:num w:numId="21" w16cid:durableId="1198350830">
-    <w:abstractNumId w:val="4"/>
+    <w:abstractNumId w:val="5"/>
   </w:num>
   <w:num w:numId="22" w16cid:durableId="1147554696">
-    <w:abstractNumId w:val="19"/>
+    <w:abstractNumId w:val="20"/>
   </w:num>
   <w:num w:numId="23" w16cid:durableId="965236107">
-    <w:abstractNumId w:val="22"/>
+    <w:abstractNumId w:val="23"/>
   </w:num>
   <w:num w:numId="24" w16cid:durableId="1615942045">
-    <w:abstractNumId w:val="5"/>
+    <w:abstractNumId w:val="6"/>
   </w:num>
   <w:num w:numId="25" w16cid:durableId="942154829">
-    <w:abstractNumId w:val="24"/>
+    <w:abstractNumId w:val="25"/>
+  </w:num>
+  <w:num w:numId="26" w16cid:durableId="583537288">
+    <w:abstractNumId w:val="3"/>
   </w:num>
   <w:numIdMacAtCleanup w:val="5"/>
 </w:numbering>
 </file>
 
 <file path=word/styles.xml><?xml version="1.0" encoding="utf-8"?>
-<w:styles xmlns:mc="http://schemas.openxmlformats.org/markup-compatibility/2006" xmlns:r="http://schemas.openxmlformats.org/officeDocument/2006/relationships" xmlns:w="http://schemas.openxmlformats.org/wordprocessingml/2006/main" xmlns:w14="http://schemas.microsoft.com/office/word/2010/wordml" xmlns:w15="http://schemas.microsoft.com/office/word/2012/wordml" xmlns:w16cex="http://schemas.microsoft.com/office/word/2018/wordml/cex" xmlns:w16cid="http://schemas.microsoft.com/office/word/2016/wordml/cid" xmlns:w16="http://schemas.microsoft.com/office/word/2018/wordml" xmlns:w16du="http://schemas.microsoft.com/office/word/2023/wordml/word16du" xmlns:w16sdtdh="http://schemas.microsoft.com/office/word/2020/wordml/sdtdatahash" xmlns:w16se="http://schemas.microsoft.com/office/word/2015/wordml/symex" mc:Ignorable="w14 w15 w16se w16cid w16 w16cex w16sdtdh w16du">
+<w:styles xmlns:mc="http://schemas.openxmlformats.org/markup-compatibility/2006" xmlns:r="http://schemas.openxmlformats.org/officeDocument/2006/relationships" xmlns:w="http://schemas.openxmlformats.org/wordprocessingml/2006/main" xmlns:w14="http://schemas.microsoft.com/office/word/2010/wordml" xmlns:w15="http://schemas.microsoft.com/office/word/2012/wordml" xmlns:w16cex="http://schemas.microsoft.com/office/word/2018/wordml/cex" xmlns:w16cid="http://schemas.microsoft.com/office/word/2016/wordml/cid" xmlns:w16="http://schemas.microsoft.com/office/word/2018/wordml" xmlns:w16du="http://schemas.microsoft.com/office/word/2023/wordml/word16du" xmlns:w16sdtdh="http://schemas.microsoft.com/office/word/2020/wordml/sdtdatahash" xmlns:w16sdtfl="http://schemas.microsoft.com/office/word/2024/wordml/sdtformatlock" xmlns:w16se="http://schemas.microsoft.com/office/word/2015/wordml/symex" mc:Ignorable="w14 w15 w16se w16cid w16 w16cex w16sdtdh w16sdtfl w16du">
   <w:docDefaults>
     <w:rPrDefault>
       <w:rPr>
@@ -6144,6 +6426,7 @@
   <w:style w:type="character" w:default="1" w:styleId="DefaultParagraphFont">
     <w:name w:val="Default Paragraph Font"/>
     <w:uiPriority w:val="1"/>
+    <w:semiHidden/>
     <w:unhideWhenUsed/>
   </w:style>
   <w:style w:type="table" w:default="1" w:styleId="TableNormal">

</xml_diff>